<commit_message>
Document M7 deployment; refresh Word exports
Records D-009 (deployment decisions: Vercel's first-deploy-to-production
behavior, project rename, Root Directory set via direct API call since no
CLI/dashboard path exists, deploy hook created via a direct REST call).
Updates status/plan docs to reflect the live site and resolves R-002
(DuckDB-on-Vercel risk, confirmed working). User guide and technical spec
now point at the real hosted URL instead of "not yet deployed"; Word
exports regenerated to match, including a corrected diagram for the
as-built cron/deploy-hook flow.
</commit_message>
<xml_diff>
--- a/Project Documents/surveillance-dashboard/09-user-guide.docx
+++ b/Project Documents/surveillance-dashboard/09-user-guide.docx
@@ -191,7 +191,65 @@
         <w:rPr>
           <w:rFonts w:ascii="Calibri" w:cs="Calibri" w:eastAsia="Calibri" w:hAnsi="Calibri"/>
         </w:rPr>
-        <w:t xml:space="preserve">The dashboard's hosted URL (recorded here once deployed in M7 — not yet deployed as of this writing; currently runs locally via </w:t>
+        <w:t xml:space="preserve">The dashboard's hosted URL: </w:t>
+      </w:r>
+      <w:r>
+        <w:rPr>
+          <w:rFonts w:ascii="Calibri" w:cs="Calibri" w:eastAsia="Calibri" w:hAnsi="Calibri"/>
+          <w:b/>
+          <w:bCs/>
+        </w:rPr>
+        <w:t xml:space="preserve">https://web-six-sage-30.vercel.app</w:t>
+      </w:r>
+      <w:r>
+        <w:rPr>
+          <w:rFonts w:ascii="Calibri" w:cs="Calibri" w:eastAsia="Calibri" w:hAnsi="Calibri"/>
+        </w:rPr>
+        <w:t xml:space="preserve"> (unlisted, not linked publicly anywhere — no login required, per the personal-use scope).</w:t>
+      </w:r>
+    </w:p>
+    <w:p/>
+    <w:p>
+      <w:pPr>
+        <w:pStyle w:val="Heading1"/>
+        <w:spacing w:after="120" w:before="240"/>
+      </w:pPr>
+      <w:r>
+        <w:rPr>
+          <w:rFonts w:ascii="Calibri" w:cs="Calibri" w:eastAsia="Calibri" w:hAnsi="Calibri"/>
+        </w:rPr>
+        <w:t xml:space="preserve">Installation or access</w:t>
+      </w:r>
+    </w:p>
+    <w:p/>
+    <w:p>
+      <w:pPr>
+        <w:pStyle w:val="ListParagraph"/>
+        <w:numPr>
+          <w:ilvl w:val="0"/>
+          <w:numId w:val="2"/>
+        </w:numPr>
+      </w:pPr>
+      <w:r>
+        <w:rPr>
+          <w:rFonts w:ascii="Calibri" w:cs="Calibri" w:eastAsia="Calibri" w:hAnsi="Calibri"/>
+        </w:rPr>
+        <w:t xml:space="preserve">Hosted (recommended): open https://web-six-sage-30.vercel.app directly. The site rebuilds automatically once a day (12:00 UTC) via Vercel Cron, re-running the full data pipeline so it stays current without any manual step.</w:t>
+      </w:r>
+    </w:p>
+    <w:p>
+      <w:pPr>
+        <w:pStyle w:val="ListParagraph"/>
+        <w:numPr>
+          <w:ilvl w:val="0"/>
+          <w:numId w:val="2"/>
+        </w:numPr>
+      </w:pPr>
+      <w:r>
+        <w:rPr>
+          <w:rFonts w:ascii="Calibri" w:cs="Calibri" w:eastAsia="Calibri" w:hAnsi="Calibri"/>
+        </w:rPr>
+        <w:t xml:space="preserve">Local development: from the </w:t>
       </w:r>
       <w:r>
         <w:rPr>
@@ -200,13 +258,13 @@
           <w:szCs w:val="20"/>
           <w:shd w:fill="F2F2F2"/>
         </w:rPr>
-        <w:t xml:space="preserve">npm run dev</w:t>
-      </w:r>
-      <w:r>
-        <w:rPr>
-          <w:rFonts w:ascii="Calibri" w:cs="Calibri" w:eastAsia="Calibri" w:hAnsi="Calibri"/>
-        </w:rPr>
-        <w:t xml:space="preserve"> in </w:t>
+        <w:t xml:space="preserve">web/</w:t>
+      </w:r>
+      <w:r>
+        <w:rPr>
+          <w:rFonts w:ascii="Calibri" w:cs="Calibri" w:eastAsia="Calibri" w:hAnsi="Calibri"/>
+        </w:rPr>
+        <w:t xml:space="preserve"> folder, run </w:t>
       </w:r>
       <w:r>
         <w:rPr>
@@ -215,42 +273,13 @@
           <w:szCs w:val="20"/>
           <w:shd w:fill="F2F2F2"/>
         </w:rPr>
-        <w:t xml:space="preserve">web/</w:t>
-      </w:r>
-      <w:r>
-        <w:rPr>
-          <w:rFonts w:ascii="Calibri" w:cs="Calibri" w:eastAsia="Calibri" w:hAnsi="Calibri"/>
-        </w:rPr>
-        <w:t xml:space="preserve">).</w:t>
-      </w:r>
-    </w:p>
-    <w:p/>
-    <w:p>
-      <w:pPr>
-        <w:pStyle w:val="Heading1"/>
-        <w:spacing w:after="120" w:before="240"/>
-      </w:pPr>
-      <w:r>
-        <w:rPr>
-          <w:rFonts w:ascii="Calibri" w:cs="Calibri" w:eastAsia="Calibri" w:hAnsi="Calibri"/>
-        </w:rPr>
-        <w:t xml:space="preserve">Installation or access</w:t>
-      </w:r>
-    </w:p>
-    <w:p/>
-    <w:p>
-      <w:pPr>
-        <w:pStyle w:val="ListParagraph"/>
-        <w:numPr>
-          <w:ilvl w:val="0"/>
-          <w:numId w:val="2"/>
-        </w:numPr>
-      </w:pPr>
-      <w:r>
-        <w:rPr>
-          <w:rFonts w:ascii="Calibri" w:cs="Calibri" w:eastAsia="Calibri" w:hAnsi="Calibri"/>
-        </w:rPr>
-        <w:t xml:space="preserve">Local development: from the </w:t>
+        <w:t xml:space="preserve">npm install</w:t>
+      </w:r>
+      <w:r>
+        <w:rPr>
+          <w:rFonts w:ascii="Calibri" w:cs="Calibri" w:eastAsia="Calibri" w:hAnsi="Calibri"/>
+        </w:rPr>
+        <w:t xml:space="preserve"> once, then </w:t>
       </w:r>
       <w:r>
         <w:rPr>
@@ -259,13 +288,13 @@
           <w:szCs w:val="20"/>
           <w:shd w:fill="F2F2F2"/>
         </w:rPr>
-        <w:t xml:space="preserve">web/</w:t>
-      </w:r>
-      <w:r>
-        <w:rPr>
-          <w:rFonts w:ascii="Calibri" w:cs="Calibri" w:eastAsia="Calibri" w:hAnsi="Calibri"/>
-        </w:rPr>
-        <w:t xml:space="preserve"> folder, run </w:t>
+        <w:t xml:space="preserve">npm run dev</w:t>
+      </w:r>
+      <w:r>
+        <w:rPr>
+          <w:rFonts w:ascii="Calibri" w:cs="Calibri" w:eastAsia="Calibri" w:hAnsi="Calibri"/>
+        </w:rPr>
+        <w:t xml:space="preserve"> and open the printed </w:t>
       </w:r>
       <w:r>
         <w:rPr>
@@ -274,13 +303,13 @@
           <w:szCs w:val="20"/>
           <w:shd w:fill="F2F2F2"/>
         </w:rPr>
-        <w:t xml:space="preserve">npm install</w:t>
-      </w:r>
-      <w:r>
-        <w:rPr>
-          <w:rFonts w:ascii="Calibri" w:cs="Calibri" w:eastAsia="Calibri" w:hAnsi="Calibri"/>
-        </w:rPr>
-        <w:t xml:space="preserve"> once, then </w:t>
+        <w:t xml:space="preserve">localhost</w:t>
+      </w:r>
+      <w:r>
+        <w:rPr>
+          <w:rFonts w:ascii="Calibri" w:cs="Calibri" w:eastAsia="Calibri" w:hAnsi="Calibri"/>
+        </w:rPr>
+        <w:t xml:space="preserve"> URL. The data pipeline runs automatically before each build (</w:t>
       </w:r>
       <w:r>
         <w:rPr>
@@ -289,13 +318,13 @@
           <w:szCs w:val="20"/>
           <w:shd w:fill="F2F2F2"/>
         </w:rPr>
-        <w:t xml:space="preserve">npm run dev</w:t>
-      </w:r>
-      <w:r>
-        <w:rPr>
-          <w:rFonts w:ascii="Calibri" w:cs="Calibri" w:eastAsia="Calibri" w:hAnsi="Calibri"/>
-        </w:rPr>
-        <w:t xml:space="preserve"> and open the printed </w:t>
+        <w:t xml:space="preserve">npm run build</w:t>
+      </w:r>
+      <w:r>
+        <w:rPr>
+          <w:rFonts w:ascii="Calibri" w:cs="Calibri" w:eastAsia="Calibri" w:hAnsi="Calibri"/>
+        </w:rPr>
+        <w:t xml:space="preserve">) via the </w:t>
       </w:r>
       <w:r>
         <w:rPr>
@@ -304,13 +333,13 @@
           <w:szCs w:val="20"/>
           <w:shd w:fill="F2F2F2"/>
         </w:rPr>
-        <w:t xml:space="preserve">localhost</w:t>
-      </w:r>
-      <w:r>
-        <w:rPr>
-          <w:rFonts w:ascii="Calibri" w:cs="Calibri" w:eastAsia="Calibri" w:hAnsi="Calibri"/>
-        </w:rPr>
-        <w:t xml:space="preserve"> URL. The data pipeline runs automatically before each build (</w:t>
+        <w:t xml:space="preserve">prebuild</w:t>
+      </w:r>
+      <w:r>
+        <w:rPr>
+          <w:rFonts w:ascii="Calibri" w:cs="Calibri" w:eastAsia="Calibri" w:hAnsi="Calibri"/>
+        </w:rPr>
+        <w:t xml:space="preserve"> script; for local dev, run </w:t>
       </w:r>
       <w:r>
         <w:rPr>
@@ -319,13 +348,13 @@
           <w:szCs w:val="20"/>
           <w:shd w:fill="F2F2F2"/>
         </w:rPr>
-        <w:t xml:space="preserve">npm run build</w:t>
-      </w:r>
-      <w:r>
-        <w:rPr>
-          <w:rFonts w:ascii="Calibri" w:cs="Calibri" w:eastAsia="Calibri" w:hAnsi="Calibri"/>
-        </w:rPr>
-        <w:t xml:space="preserve">) via the </w:t>
+        <w:t xml:space="preserve">npm run build:data</w:t>
+      </w:r>
+      <w:r>
+        <w:rPr>
+          <w:rFonts w:ascii="Calibri" w:cs="Calibri" w:eastAsia="Calibri" w:hAnsi="Calibri"/>
+        </w:rPr>
+        <w:t xml:space="preserve"> manually first (or after pulling new code) to refresh the generated JSON in </w:t>
       </w:r>
       <w:r>
         <w:rPr>
@@ -334,36 +363,6 @@
           <w:szCs w:val="20"/>
           <w:shd w:fill="F2F2F2"/>
         </w:rPr>
-        <w:t xml:space="preserve">prebuild</w:t>
-      </w:r>
-      <w:r>
-        <w:rPr>
-          <w:rFonts w:ascii="Calibri" w:cs="Calibri" w:eastAsia="Calibri" w:hAnsi="Calibri"/>
-        </w:rPr>
-        <w:t xml:space="preserve"> script; for local dev, run </w:t>
-      </w:r>
-      <w:r>
-        <w:rPr>
-          <w:rFonts w:ascii="Consolas" w:cs="Consolas" w:eastAsia="Consolas" w:hAnsi="Consolas"/>
-          <w:sz w:val="20"/>
-          <w:szCs w:val="20"/>
-          <w:shd w:fill="F2F2F2"/>
-        </w:rPr>
-        <w:t xml:space="preserve">npm run build:data</w:t>
-      </w:r>
-      <w:r>
-        <w:rPr>
-          <w:rFonts w:ascii="Calibri" w:cs="Calibri" w:eastAsia="Calibri" w:hAnsi="Calibri"/>
-        </w:rPr>
-        <w:t xml:space="preserve"> manually first (or after pulling new code) to refresh the generated JSON in </w:t>
-      </w:r>
-      <w:r>
-        <w:rPr>
-          <w:rFonts w:ascii="Consolas" w:cs="Consolas" w:eastAsia="Consolas" w:hAnsi="Consolas"/>
-          <w:sz w:val="20"/>
-          <w:szCs w:val="20"/>
-          <w:shd w:fill="F2F2F2"/>
-        </w:rPr>
         <w:t xml:space="preserve">web/data/generated/</w:t>
       </w:r>
       <w:r>
@@ -371,21 +370,6 @@
           <w:rFonts w:ascii="Calibri" w:cs="Calibri" w:eastAsia="Calibri" w:hAnsi="Calibri"/>
         </w:rPr>
         <w:t xml:space="preserve">.</w:t>
-      </w:r>
-    </w:p>
-    <w:p>
-      <w:pPr>
-        <w:pStyle w:val="ListParagraph"/>
-        <w:numPr>
-          <w:ilvl w:val="0"/>
-          <w:numId w:val="2"/>
-        </w:numPr>
-      </w:pPr>
-      <w:r>
-        <w:rPr>
-          <w:rFonts w:ascii="Calibri" w:cs="Calibri" w:eastAsia="Calibri" w:hAnsi="Calibri"/>
-        </w:rPr>
-        <w:t xml:space="preserve">Hosted access: to be added once M7 (Vercel deployment + scheduled rebuild) is complete.</w:t>
       </w:r>
     </w:p>
     <w:p/>
@@ -2280,6 +2264,50 @@
               <w:rPr>
                 <w:b/>
                 <w:bCs/>
+                <w:sz w:val="20"/>
+                <w:szCs w:val="20"/>
+              </w:rPr>
+            </w:r>
+          </w:p>
+        </w:tc>
+      </w:tr>
+      <w:tr>
+        <w:trPr>
+          <w:tblHeader w:val="false"/>
+        </w:trPr>
+        <w:tc>
+          <w:tcPr>
+            <w:tcW w:type="pct" w:w="33.333333333333336%"/>
+          </w:tcPr>
+          <w:p>
+            <w:r>
+              <w:rPr>
+                <w:sz w:val="20"/>
+                <w:szCs w:val="20"/>
+              </w:rPr>
+            </w:r>
+          </w:p>
+        </w:tc>
+        <w:tc>
+          <w:tcPr>
+            <w:tcW w:type="pct" w:w="33.333333333333336%"/>
+          </w:tcPr>
+          <w:p>
+            <w:r>
+              <w:rPr>
+                <w:sz w:val="20"/>
+                <w:szCs w:val="20"/>
+              </w:rPr>
+            </w:r>
+          </w:p>
+        </w:tc>
+        <w:tc>
+          <w:tcPr>
+            <w:tcW w:type="pct" w:w="33.333333333333336%"/>
+          </w:tcPr>
+          <w:p>
+            <w:r>
+              <w:rPr>
                 <w:sz w:val="20"/>
                 <w:szCs w:val="20"/>
               </w:rPr>

</xml_diff>